<commit_message>
docs(v2): polish and replace STEP00 DOCX; remove branch-only workflow
</commit_message>
<xml_diff>
--- a/docs/v2_0_3_0_planning/docx/00_V2_0.3.0_PRODUCT_GAP_AUDIT_AND_RECOVERY_SCOPE.docx
+++ b/docs/v2_0_3_0_planning/docx/00_V2_0.3.0_PRODUCT_GAP_AUDIT_AND_RECOVERY_SCOPE.docx
@@ -67,9 +67,13 @@
             <w:tcW w:type="dxa" w:w="4819"/>
           </w:tcPr>
           <w:p>
+            <w:pPr>
+              <w:spacing w:after="0"/>
+            </w:pPr>
             <w:r>
               <w:rPr>
                 <w:b/>
+                <w:sz w:val="15"/>
               </w:rPr>
               <w:t>Repository</w:t>
             </w:r>
@@ -80,7 +84,13 @@
             <w:tcW w:type="dxa" w:w="4819"/>
           </w:tcPr>
           <w:p>
+            <w:pPr>
+              <w:spacing w:after="0"/>
+            </w:pPr>
             <w:r>
+              <w:rPr>
+                <w:sz w:val="15"/>
+              </w:rPr>
               <w:t>inoriko920-dev/V2-AI-Video-Composer</w:t>
             </w:r>
           </w:p>
@@ -95,9 +105,13 @@
             <w:tcW w:type="dxa" w:w="4819"/>
           </w:tcPr>
           <w:p>
+            <w:pPr>
+              <w:spacing w:after="0"/>
+            </w:pPr>
             <w:r>
               <w:rPr>
                 <w:b/>
+                <w:sz w:val="15"/>
               </w:rPr>
               <w:t>Main audit SHA</w:t>
             </w:r>
@@ -108,7 +122,13 @@
             <w:tcW w:type="dxa" w:w="4819"/>
           </w:tcPr>
           <w:p>
+            <w:pPr>
+              <w:spacing w:after="0"/>
+            </w:pPr>
             <w:r>
+              <w:rPr>
+                <w:sz w:val="15"/>
+              </w:rPr>
               <w:t>186844bdab3a8665488204fd75b9309f1fad5d5b</w:t>
             </w:r>
           </w:p>
@@ -123,9 +143,13 @@
             <w:tcW w:type="dxa" w:w="4819"/>
           </w:tcPr>
           <w:p>
+            <w:pPr>
+              <w:spacing w:after="0"/>
+            </w:pPr>
             <w:r>
               <w:rPr>
                 <w:b/>
+                <w:sz w:val="15"/>
               </w:rPr>
               <w:t>Frozen stable</w:t>
             </w:r>
@@ -136,7 +160,13 @@
             <w:tcW w:type="dxa" w:w="4819"/>
           </w:tcPr>
           <w:p>
+            <w:pPr>
+              <w:spacing w:after="0"/>
+            </w:pPr>
             <w:r>
+              <w:rPr>
+                <w:sz w:val="15"/>
+              </w:rPr>
               <w:t>v0.2.2 @ eeabf1ffbfac6cbb6cafc82116fc3599bdbc2bef</w:t>
             </w:r>
           </w:p>
@@ -151,9 +181,13 @@
             <w:tcW w:type="dxa" w:w="4819"/>
           </w:tcPr>
           <w:p>
+            <w:pPr>
+              <w:spacing w:after="0"/>
+            </w:pPr>
             <w:r>
               <w:rPr>
                 <w:b/>
+                <w:sz w:val="15"/>
               </w:rPr>
               <w:t>Main goal</w:t>
             </w:r>
@@ -164,7 +198,13 @@
             <w:tcW w:type="dxa" w:w="4819"/>
           </w:tcPr>
           <w:p>
+            <w:pPr>
+              <w:spacing w:after="0"/>
+            </w:pPr>
             <w:r>
+              <w:rPr>
+                <w:sz w:val="15"/>
+              </w:rPr>
               <w:t>GAP-03A autosave + Restore/Discard/Cancel recovery</w:t>
             </w:r>
           </w:p>
@@ -179,9 +219,13 @@
             <w:tcW w:type="dxa" w:w="4819"/>
           </w:tcPr>
           <w:p>
+            <w:pPr>
+              <w:spacing w:after="0"/>
+            </w:pPr>
             <w:r>
               <w:rPr>
                 <w:b/>
+                <w:sz w:val="15"/>
               </w:rPr>
               <w:t>Authorization</w:t>
             </w:r>
@@ -192,7 +236,13 @@
             <w:tcW w:type="dxa" w:w="4819"/>
           </w:tcPr>
           <w:p>
+            <w:pPr>
+              <w:spacing w:after="0"/>
+            </w:pPr>
             <w:r>
+              <w:rPr>
+                <w:sz w:val="15"/>
+              </w:rPr>
               <w:t>Planning only; no coding or UI changes</w:t>
             </w:r>
           </w:p>
@@ -207,9 +257,13 @@
             <w:tcW w:type="dxa" w:w="4819"/>
           </w:tcPr>
           <w:p>
+            <w:pPr>
+              <w:spacing w:after="0"/>
+            </w:pPr>
             <w:r>
               <w:rPr>
                 <w:b/>
+                <w:sz w:val="15"/>
               </w:rPr>
               <w:t>UI hard stop</w:t>
             </w:r>
@@ -220,7 +274,13 @@
             <w:tcW w:type="dxa" w:w="4819"/>
           </w:tcPr>
           <w:p>
+            <w:pPr>
+              <w:spacing w:after="0"/>
+            </w:pPr>
             <w:r>
+              <w:rPr>
+                <w:sz w:val="15"/>
+              </w:rPr>
               <w:t>Required at future UI-prompt STEP</w:t>
             </w:r>
           </w:p>
@@ -1000,17 +1060,21 @@
       <w:tr>
         <w:trPr>
           <w:cantSplit/>
+          <w:tblHeader w:val="1"/>
         </w:trPr>
         <w:tc>
           <w:tcPr>
             <w:tcW w:type="dxa" w:w="3213"/>
           </w:tcPr>
           <w:p>
+            <w:pPr>
+              <w:spacing w:after="0"/>
+            </w:pPr>
             <w:r>
               <w:rPr>
                 <w:b/>
                 <w:color w:val="163F6E"/>
-                <w:sz w:val="16"/>
+                <w:sz w:val="15"/>
               </w:rPr>
               <w:t>Option</w:t>
             </w:r>
@@ -1021,11 +1085,14 @@
             <w:tcW w:type="dxa" w:w="3213"/>
           </w:tcPr>
           <w:p>
+            <w:pPr>
+              <w:spacing w:after="0"/>
+            </w:pPr>
             <w:r>
               <w:rPr>
                 <w:b/>
                 <w:color w:val="163F6E"/>
-                <w:sz w:val="16"/>
+                <w:sz w:val="15"/>
               </w:rPr>
               <w:t>Assessment</w:t>
             </w:r>
@@ -1036,11 +1103,14 @@
             <w:tcW w:type="dxa" w:w="3213"/>
           </w:tcPr>
           <w:p>
+            <w:pPr>
+              <w:spacing w:after="0"/>
+            </w:pPr>
             <w:r>
               <w:rPr>
                 <w:b/>
                 <w:color w:val="163F6E"/>
-                <w:sz w:val="16"/>
+                <w:sz w:val="15"/>
               </w:rPr>
               <w:t>Decision at STEP 00</w:t>
             </w:r>
@@ -1056,9 +1126,12 @@
             <w:tcW w:type="dxa" w:w="3213"/>
           </w:tcPr>
           <w:p>
+            <w:pPr>
+              <w:spacing w:after="0"/>
+            </w:pPr>
             <w:r>
               <w:rPr>
-                <w:sz w:val="16"/>
+                <w:sz w:val="15"/>
               </w:rPr>
               <w:t>Reuse existing RecoveryManager, ProjectSession, Qt lifecycle</w:t>
             </w:r>
@@ -1069,9 +1142,12 @@
             <w:tcW w:type="dxa" w:w="3213"/>
           </w:tcPr>
           <w:p>
+            <w:pPr>
+              <w:spacing w:after="0"/>
+            </w:pPr>
             <w:r>
               <w:rPr>
-                <w:sz w:val="16"/>
+                <w:sz w:val="15"/>
               </w:rPr>
               <w:t>Already owned, tested, schema compatible and consistent with repository architecture</w:t>
             </w:r>
@@ -1082,10 +1158,13 @@
             <w:tcW w:type="dxa" w:w="3213"/>
           </w:tcPr>
           <w:p>
+            <w:pPr>
+              <w:spacing w:after="0"/>
+            </w:pPr>
             <w:r>
               <w:rPr>
                 <w:b/>
-                <w:sz w:val="16"/>
+                <w:sz w:val="15"/>
               </w:rPr>
               <w:t>Preferred starting point</w:t>
             </w:r>
@@ -1101,9 +1180,12 @@
             <w:tcW w:type="dxa" w:w="3213"/>
           </w:tcPr>
           <w:p>
+            <w:pPr>
+              <w:spacing w:after="0"/>
+            </w:pPr>
             <w:r>
               <w:rPr>
-                <w:sz w:val="16"/>
+                <w:sz w:val="15"/>
               </w:rPr>
               <w:t>Adopt an external auto-recovery repository or new framework</w:t>
             </w:r>
@@ -1114,9 +1196,12 @@
             <w:tcW w:type="dxa" w:w="3213"/>
           </w:tcPr>
           <w:p>
+            <w:pPr>
+              <w:spacing w:after="0"/>
+            </w:pPr>
             <w:r>
               <w:rPr>
-                <w:sz w:val="16"/>
+                <w:sz w:val="15"/>
               </w:rPr>
               <w:t>Would add integration and license/dependency risks; not necessary unless a verified missing capability is discovered</w:t>
             </w:r>
@@ -1127,10 +1212,13 @@
             <w:tcW w:type="dxa" w:w="3213"/>
           </w:tcPr>
           <w:p>
+            <w:pPr>
+              <w:spacing w:after="0"/>
+            </w:pPr>
             <w:r>
               <w:rPr>
                 <w:b/>
-                <w:sz w:val="16"/>
+                <w:sz w:val="15"/>
               </w:rPr>
               <w:t>Do not adopt at STEP 00</w:t>
             </w:r>
@@ -1146,9 +1234,12 @@
             <w:tcW w:type="dxa" w:w="3213"/>
           </w:tcPr>
           <w:p>
+            <w:pPr>
+              <w:spacing w:after="0"/>
+            </w:pPr>
             <w:r>
               <w:rPr>
-                <w:sz w:val="16"/>
+                <w:sz w:val="15"/>
               </w:rPr>
               <w:t>Rewrite project serialization or introduce a second recovery store</w:t>
             </w:r>
@@ -1159,9 +1250,12 @@
             <w:tcW w:type="dxa" w:w="3213"/>
           </w:tcPr>
           <w:p>
+            <w:pPr>
+              <w:spacing w:after="0"/>
+            </w:pPr>
             <w:r>
               <w:rPr>
-                <w:sz w:val="16"/>
+                <w:sz w:val="15"/>
               </w:rPr>
               <w:t>Would risk v3/v4 backwards compatibility, existing backups and atomic semantics</w:t>
             </w:r>
@@ -1172,10 +1266,13 @@
             <w:tcW w:type="dxa" w:w="3213"/>
           </w:tcPr>
           <w:p>
+            <w:pPr>
+              <w:spacing w:after="0"/>
+            </w:pPr>
             <w:r>
               <w:rPr>
                 <w:b/>
-                <w:sz w:val="16"/>
+                <w:sz w:val="15"/>
               </w:rPr>
               <w:t>Prohibited absent new architecture gate</w:t>
             </w:r>
@@ -1191,9 +1288,12 @@
             <w:tcW w:type="dxa" w:w="3213"/>
           </w:tcPr>
           <w:p>
+            <w:pPr>
+              <w:spacing w:after="0"/>
+            </w:pPr>
             <w:r>
               <w:rPr>
-                <w:sz w:val="16"/>
+                <w:sz w:val="15"/>
               </w:rPr>
               <w:t>Build new UI from scratch</w:t>
             </w:r>
@@ -1204,9 +1304,12 @@
             <w:tcW w:type="dxa" w:w="3213"/>
           </w:tcPr>
           <w:p>
+            <w:pPr>
+              <w:spacing w:after="0"/>
+            </w:pPr>
             <w:r>
               <w:rPr>
-                <w:sz w:val="16"/>
+                <w:sz w:val="15"/>
               </w:rPr>
               <w:t>Conflicts with frozen 42 UI references and established white/blue Qt style</w:t>
             </w:r>
@@ -1217,10 +1320,13 @@
             <w:tcW w:type="dxa" w:w="3213"/>
           </w:tcPr>
           <w:p>
+            <w:pPr>
+              <w:spacing w:after="0"/>
+            </w:pPr>
             <w:r>
               <w:rPr>
                 <w:b/>
-                <w:sz w:val="16"/>
+                <w:sz w:val="15"/>
               </w:rPr>
               <w:t>Prohibited</w:t>
             </w:r>
@@ -1452,17 +1558,21 @@
       <w:tr>
         <w:trPr>
           <w:cantSplit/>
+          <w:tblHeader w:val="1"/>
         </w:trPr>
         <w:tc>
           <w:tcPr>
             <w:tcW w:type="dxa" w:w="3213"/>
           </w:tcPr>
           <w:p>
+            <w:pPr>
+              <w:spacing w:after="0"/>
+            </w:pPr>
             <w:r>
               <w:rPr>
                 <w:b/>
                 <w:color w:val="163F6E"/>
-                <w:sz w:val="16"/>
+                <w:sz w:val="15"/>
               </w:rPr>
               <w:t>ID</w:t>
             </w:r>
@@ -1473,11 +1583,14 @@
             <w:tcW w:type="dxa" w:w="3213"/>
           </w:tcPr>
           <w:p>
+            <w:pPr>
+              <w:spacing w:after="0"/>
+            </w:pPr>
             <w:r>
               <w:rPr>
                 <w:b/>
                 <w:color w:val="163F6E"/>
-                <w:sz w:val="16"/>
+                <w:sz w:val="15"/>
               </w:rPr>
               <w:t>Risk / required decision</w:t>
             </w:r>
@@ -1488,11 +1601,14 @@
             <w:tcW w:type="dxa" w:w="3213"/>
           </w:tcPr>
           <w:p>
+            <w:pPr>
+              <w:spacing w:after="0"/>
+            </w:pPr>
             <w:r>
               <w:rPr>
                 <w:b/>
                 <w:color w:val="163F6E"/>
-                <w:sz w:val="16"/>
+                <w:sz w:val="15"/>
               </w:rPr>
               <w:t>Planned resolution</w:t>
             </w:r>
@@ -1508,9 +1624,12 @@
             <w:tcW w:type="dxa" w:w="3213"/>
           </w:tcPr>
           <w:p>
+            <w:pPr>
+              <w:spacing w:after="0"/>
+            </w:pPr>
             <w:r>
               <w:rPr>
-                <w:sz w:val="16"/>
+                <w:sz w:val="15"/>
               </w:rPr>
               <w:t>R-01</w:t>
             </w:r>
@@ -1521,9 +1640,12 @@
             <w:tcW w:type="dxa" w:w="3213"/>
           </w:tcPr>
           <w:p>
+            <w:pPr>
+              <w:spacing w:after="0"/>
+            </w:pPr>
             <w:r>
               <w:rPr>
-                <w:sz w:val="16"/>
+                <w:sz w:val="15"/>
               </w:rPr>
               <w:t>Whether autosave writes while a command/Undo/Redo is incomplete</w:t>
             </w:r>
@@ -1534,9 +1656,12 @@
             <w:tcW w:type="dxa" w:w="3213"/>
           </w:tcPr>
           <w:p>
+            <w:pPr>
+              <w:spacing w:after="0"/>
+            </w:pPr>
             <w:r>
               <w:rPr>
-                <w:sz w:val="16"/>
+                <w:sz w:val="15"/>
               </w:rPr>
               <w:t>application-session scheduling contract</w:t>
             </w:r>
@@ -1552,9 +1677,12 @@
             <w:tcW w:type="dxa" w:w="3213"/>
           </w:tcPr>
           <w:p>
+            <w:pPr>
+              <w:spacing w:after="0"/>
+            </w:pPr>
             <w:r>
               <w:rPr>
-                <w:sz w:val="16"/>
+                <w:sz w:val="15"/>
               </w:rPr>
               <w:t>R-02</w:t>
             </w:r>
@@ -1565,9 +1693,12 @@
             <w:tcW w:type="dxa" w:w="3213"/>
           </w:tcPr>
           <w:p>
+            <w:pPr>
+              <w:spacing w:after="0"/>
+            </w:pPr>
             <w:r>
               <w:rPr>
-                <w:sz w:val="16"/>
+                <w:sz w:val="15"/>
               </w:rPr>
               <w:t>Snapshot freshness and stale prompts after manual save</w:t>
             </w:r>
@@ -1578,9 +1709,12 @@
             <w:tcW w:type="dxa" w:w="3213"/>
           </w:tcPr>
           <w:p>
+            <w:pPr>
+              <w:spacing w:after="0"/>
+            </w:pPr>
             <w:r>
               <w:rPr>
-                <w:sz w:val="16"/>
+                <w:sz w:val="15"/>
               </w:rPr>
               <w:t>deterministic snapshot/session policy, not timestamps alone</w:t>
             </w:r>
@@ -1596,9 +1730,12 @@
             <w:tcW w:type="dxa" w:w="3213"/>
           </w:tcPr>
           <w:p>
+            <w:pPr>
+              <w:spacing w:after="0"/>
+            </w:pPr>
             <w:r>
               <w:rPr>
-                <w:sz w:val="16"/>
+                <w:sz w:val="15"/>
               </w:rPr>
               <w:t>R-03</w:t>
             </w:r>
@@ -1609,9 +1746,12 @@
             <w:tcW w:type="dxa" w:w="3213"/>
           </w:tcPr>
           <w:p>
+            <w:pPr>
+              <w:spacing w:after="0"/>
+            </w:pPr>
             <w:r>
               <w:rPr>
-                <w:sz w:val="16"/>
+                <w:sz w:val="15"/>
               </w:rPr>
               <w:t>Restore atomicity, backups and failure injection</w:t>
             </w:r>
@@ -1622,9 +1762,12 @@
             <w:tcW w:type="dxa" w:w="3213"/>
           </w:tcPr>
           <w:p>
+            <w:pPr>
+              <w:spacing w:after="0"/>
+            </w:pPr>
             <w:r>
               <w:rPr>
-                <w:sz w:val="16"/>
+                <w:sz w:val="15"/>
               </w:rPr>
               <w:t>reuse RecoveryManager and regression tests</w:t>
             </w:r>
@@ -1640,9 +1783,12 @@
             <w:tcW w:type="dxa" w:w="3213"/>
           </w:tcPr>
           <w:p>
+            <w:pPr>
+              <w:spacing w:after="0"/>
+            </w:pPr>
             <w:r>
               <w:rPr>
-                <w:sz w:val="16"/>
+                <w:sz w:val="15"/>
               </w:rPr>
               <w:t>R-04</w:t>
             </w:r>
@@ -1653,9 +1799,12 @@
             <w:tcW w:type="dxa" w:w="3213"/>
           </w:tcPr>
           <w:p>
+            <w:pPr>
+              <w:spacing w:after="0"/>
+            </w:pPr>
             <w:r>
               <w:rPr>
-                <w:sz w:val="16"/>
+                <w:sz w:val="15"/>
               </w:rPr>
               <w:t>Cancel during unsaved-project switch</w:t>
             </w:r>
@@ -1666,9 +1815,12 @@
             <w:tcW w:type="dxa" w:w="3213"/>
           </w:tcPr>
           <w:p>
+            <w:pPr>
+              <w:spacing w:after="0"/>
+            </w:pPr>
             <w:r>
               <w:rPr>
-                <w:sz w:val="16"/>
+                <w:sz w:val="15"/>
               </w:rPr>
               <w:t>state-machine design and offscreen UI regression</w:t>
             </w:r>
@@ -1684,9 +1836,12 @@
             <w:tcW w:type="dxa" w:w="3213"/>
           </w:tcPr>
           <w:p>
+            <w:pPr>
+              <w:spacing w:after="0"/>
+            </w:pPr>
             <w:r>
               <w:rPr>
-                <w:sz w:val="16"/>
+                <w:sz w:val="15"/>
               </w:rPr>
               <w:t>R-05</w:t>
             </w:r>
@@ -1697,9 +1852,12 @@
             <w:tcW w:type="dxa" w:w="3213"/>
           </w:tcPr>
           <w:p>
+            <w:pPr>
+              <w:spacing w:after="0"/>
+            </w:pPr>
             <w:r>
               <w:rPr>
-                <w:sz w:val="16"/>
+                <w:sz w:val="15"/>
               </w:rPr>
               <w:t>Missing/corrupt/future-schema project or snapshot</w:t>
             </w:r>
@@ -1710,9 +1868,12 @@
             <w:tcW w:type="dxa" w:w="3213"/>
           </w:tcPr>
           <w:p>
+            <w:pPr>
+              <w:spacing w:after="0"/>
+            </w:pPr>
             <w:r>
               <w:rPr>
-                <w:sz w:val="16"/>
+                <w:sz w:val="15"/>
               </w:rPr>
               <w:t>fail-closed error/decision UX; never silent fallback</w:t>
             </w:r>
@@ -1728,9 +1889,12 @@
             <w:tcW w:type="dxa" w:w="3213"/>
           </w:tcPr>
           <w:p>
+            <w:pPr>
+              <w:spacing w:after="0"/>
+            </w:pPr>
             <w:r>
               <w:rPr>
-                <w:sz w:val="16"/>
+                <w:sz w:val="15"/>
               </w:rPr>
               <w:t>R-06</w:t>
             </w:r>
@@ -1741,9 +1905,12 @@
             <w:tcW w:type="dxa" w:w="3213"/>
           </w:tcPr>
           <w:p>
+            <w:pPr>
+              <w:spacing w:after="0"/>
+            </w:pPr>
             <w:r>
               <w:rPr>
-                <w:sz w:val="16"/>
+                <w:sz w:val="15"/>
               </w:rPr>
               <w:t>First unsaved project without a path and Save As transitions</w:t>
             </w:r>
@@ -1754,9 +1921,12 @@
             <w:tcW w:type="dxa" w:w="3213"/>
           </w:tcPr>
           <w:p>
+            <w:pPr>
+              <w:spacing w:after="0"/>
+            </w:pPr>
             <w:r>
               <w:rPr>
-                <w:sz w:val="16"/>
+                <w:sz w:val="15"/>
               </w:rPr>
               <w:t>explicit path policy before coding</w:t>
             </w:r>
@@ -1772,9 +1942,12 @@
             <w:tcW w:type="dxa" w:w="3213"/>
           </w:tcPr>
           <w:p>
+            <w:pPr>
+              <w:spacing w:after="0"/>
+            </w:pPr>
             <w:r>
               <w:rPr>
-                <w:sz w:val="16"/>
+                <w:sz w:val="15"/>
               </w:rPr>
               <w:t>R-07</w:t>
             </w:r>
@@ -1785,9 +1958,12 @@
             <w:tcW w:type="dxa" w:w="3213"/>
           </w:tcPr>
           <w:p>
+            <w:pPr>
+              <w:spacing w:after="0"/>
+            </w:pPr>
             <w:r>
               <w:rPr>
-                <w:sz w:val="16"/>
+                <w:sz w:val="15"/>
               </w:rPr>
               <w:t>Windows long path, Unicode path, permissions, disk full, file lock</w:t>
             </w:r>
@@ -1798,9 +1974,12 @@
             <w:tcW w:type="dxa" w:w="3213"/>
           </w:tcPr>
           <w:p>
+            <w:pPr>
+              <w:spacing w:after="0"/>
+            </w:pPr>
             <w:r>
               <w:rPr>
-                <w:sz w:val="16"/>
+                <w:sz w:val="15"/>
               </w:rPr>
               <w:t>Windows technical acceptance and fault matrix</w:t>
             </w:r>
@@ -1816,9 +1995,12 @@
             <w:tcW w:type="dxa" w:w="3213"/>
           </w:tcPr>
           <w:p>
+            <w:pPr>
+              <w:spacing w:after="0"/>
+            </w:pPr>
             <w:r>
               <w:rPr>
-                <w:sz w:val="16"/>
+                <w:sz w:val="15"/>
               </w:rPr>
               <w:t>R-08</w:t>
             </w:r>
@@ -1829,9 +2011,12 @@
             <w:tcW w:type="dxa" w:w="3213"/>
           </w:tcPr>
           <w:p>
+            <w:pPr>
+              <w:spacing w:after="0"/>
+            </w:pPr>
             <w:r>
               <w:rPr>
-                <w:sz w:val="16"/>
+                <w:sz w:val="15"/>
               </w:rPr>
               <w:t>UI parity and reentrant modal/timer callbacks</w:t>
             </w:r>
@@ -1842,9 +2027,12 @@
             <w:tcW w:type="dxa" w:w="3213"/>
           </w:tcPr>
           <w:p>
+            <w:pPr>
+              <w:spacing w:after="0"/>
+            </w:pPr>
             <w:r>
               <w:rPr>
-                <w:sz w:val="16"/>
+                <w:sz w:val="15"/>
               </w:rPr>
               <w:t>canonical Qt lifecycle/UI prompt gate</w:t>
             </w:r>
@@ -1860,9 +2048,12 @@
             <w:tcW w:type="dxa" w:w="3213"/>
           </w:tcPr>
           <w:p>
+            <w:pPr>
+              <w:spacing w:after="0"/>
+            </w:pPr>
             <w:r>
               <w:rPr>
-                <w:sz w:val="16"/>
+                <w:sz w:val="15"/>
               </w:rPr>
               <w:t>R-09</w:t>
             </w:r>
@@ -1873,9 +2064,12 @@
             <w:tcW w:type="dxa" w:w="3213"/>
           </w:tcPr>
           <w:p>
+            <w:pPr>
+              <w:spacing w:after="0"/>
+            </w:pPr>
             <w:r>
               <w:rPr>
-                <w:sz w:val="16"/>
+                <w:sz w:val="15"/>
               </w:rPr>
               <w:t>Automatic background work and shutdown races</w:t>
             </w:r>
@@ -1886,9 +2080,12 @@
             <w:tcW w:type="dxa" w:w="3213"/>
           </w:tcPr>
           <w:p>
+            <w:pPr>
+              <w:spacing w:after="0"/>
+            </w:pPr>
             <w:r>
               <w:rPr>
-                <w:sz w:val="16"/>
+                <w:sz w:val="15"/>
               </w:rPr>
               <w:t>serialized execution, cancellation and process exit contracts</w:t>
             </w:r>
@@ -1904,9 +2101,12 @@
             <w:tcW w:type="dxa" w:w="3213"/>
           </w:tcPr>
           <w:p>
+            <w:pPr>
+              <w:spacing w:after="0"/>
+            </w:pPr>
             <w:r>
               <w:rPr>
-                <w:sz w:val="16"/>
+                <w:sz w:val="15"/>
               </w:rPr>
               <w:t>R-10</w:t>
             </w:r>
@@ -1917,9 +2117,12 @@
             <w:tcW w:type="dxa" w:w="3213"/>
           </w:tcPr>
           <w:p>
+            <w:pPr>
+              <w:spacing w:after="0"/>
+            </w:pPr>
             <w:r>
               <w:rPr>
-                <w:sz w:val="16"/>
+                <w:sz w:val="15"/>
               </w:rPr>
               <w:t>Raw Gemini credentials or provider state entering snapshots/logs</w:t>
             </w:r>
@@ -1930,9 +2133,12 @@
             <w:tcW w:type="dxa" w:w="3213"/>
           </w:tcPr>
           <w:p>
+            <w:pPr>
+              <w:spacing w:after="0"/>
+            </w:pPr>
             <w:r>
               <w:rPr>
-                <w:sz w:val="16"/>
+                <w:sz w:val="15"/>
               </w:rPr>
               <w:t>redaction/serialization security tests</w:t>
             </w:r>
@@ -1948,9 +2154,12 @@
             <w:tcW w:type="dxa" w:w="3213"/>
           </w:tcPr>
           <w:p>
+            <w:pPr>
+              <w:spacing w:after="0"/>
+            </w:pPr>
             <w:r>
               <w:rPr>
-                <w:sz w:val="16"/>
+                <w:sz w:val="15"/>
               </w:rPr>
               <w:t>R-11</w:t>
             </w:r>
@@ -1961,9 +2170,12 @@
             <w:tcW w:type="dxa" w:w="3213"/>
           </w:tcPr>
           <w:p>
+            <w:pPr>
+              <w:spacing w:after="0"/>
+            </w:pPr>
             <w:r>
               <w:rPr>
-                <w:sz w:val="16"/>
+                <w:sz w:val="15"/>
               </w:rPr>
               <w:t>v3/v4 advanced-animation contract mutation</w:t>
             </w:r>
@@ -1974,9 +2186,12 @@
             <w:tcW w:type="dxa" w:w="3213"/>
           </w:tcPr>
           <w:p>
+            <w:pPr>
+              <w:spacing w:after="0"/>
+            </w:pPr>
             <w:r>
               <w:rPr>
-                <w:sz w:val="16"/>
+                <w:sz w:val="15"/>
               </w:rPr>
               <w:t>regression suite and future-schema guard</w:t>
             </w:r>
@@ -1992,9 +2207,12 @@
             <w:tcW w:type="dxa" w:w="3213"/>
           </w:tcPr>
           <w:p>
+            <w:pPr>
+              <w:spacing w:after="0"/>
+            </w:pPr>
             <w:r>
               <w:rPr>
-                <w:sz w:val="16"/>
+                <w:sz w:val="15"/>
               </w:rPr>
               <w:t>R-12</w:t>
             </w:r>
@@ -2005,9 +2223,12 @@
             <w:tcW w:type="dxa" w:w="3213"/>
           </w:tcPr>
           <w:p>
+            <w:pPr>
+              <w:spacing w:after="0"/>
+            </w:pPr>
             <w:r>
               <w:rPr>
-                <w:sz w:val="16"/>
+                <w:sz w:val="15"/>
               </w:rPr>
               <w:t>Background/autosave impact on large real projects</w:t>
             </w:r>
@@ -2018,9 +2239,12 @@
             <w:tcW w:type="dxa" w:w="3213"/>
           </w:tcPr>
           <w:p>
+            <w:pPr>
+              <w:spacing w:after="0"/>
+            </w:pPr>
             <w:r>
               <w:rPr>
-                <w:sz w:val="16"/>
+                <w:sz w:val="15"/>
               </w:rPr>
               <w:t>performance budget, 10/100/500 scene *command construction* separation</w:t>
             </w:r>
@@ -2384,17 +2608,21 @@
       <w:tr>
         <w:trPr>
           <w:cantSplit/>
+          <w:tblHeader w:val="1"/>
         </w:trPr>
         <w:tc>
           <w:tcPr>
             <w:tcW w:type="dxa" w:w="3213"/>
           </w:tcPr>
           <w:p>
+            <w:pPr>
+              <w:spacing w:after="0"/>
+            </w:pPr>
             <w:r>
               <w:rPr>
                 <w:b/>
                 <w:color w:val="163F6E"/>
-                <w:sz w:val="16"/>
+                <w:sz w:val="15"/>
               </w:rPr>
               <w:t>STEP</w:t>
             </w:r>
@@ -2405,11 +2633,14 @@
             <w:tcW w:type="dxa" w:w="3213"/>
           </w:tcPr>
           <w:p>
+            <w:pPr>
+              <w:spacing w:after="0"/>
+            </w:pPr>
             <w:r>
               <w:rPr>
                 <w:b/>
                 <w:color w:val="163F6E"/>
-                <w:sz w:val="16"/>
+                <w:sz w:val="15"/>
               </w:rPr>
               <w:t>Deliverable</w:t>
             </w:r>
@@ -2420,11 +2651,14 @@
             <w:tcW w:type="dxa" w:w="3213"/>
           </w:tcPr>
           <w:p>
+            <w:pPr>
+              <w:spacing w:after="0"/>
+            </w:pPr>
             <w:r>
               <w:rPr>
                 <w:b/>
                 <w:color w:val="163F6E"/>
-                <w:sz w:val="16"/>
+                <w:sz w:val="15"/>
               </w:rPr>
               <w:t>Gate</w:t>
             </w:r>
@@ -2440,10 +2674,13 @@
             <w:tcW w:type="dxa" w:w="3213"/>
           </w:tcPr>
           <w:p>
+            <w:pPr>
+              <w:spacing w:after="0"/>
+            </w:pPr>
             <w:r>
               <w:rPr>
                 <w:b/>
-                <w:sz w:val="16"/>
+                <w:sz w:val="15"/>
               </w:rPr>
               <w:t>00 — this turn</w:t>
             </w:r>
@@ -2454,9 +2691,12 @@
             <w:tcW w:type="dxa" w:w="3213"/>
           </w:tcPr>
           <w:p>
+            <w:pPr>
+              <w:spacing w:after="0"/>
+            </w:pPr>
             <w:r>
               <w:rPr>
-                <w:sz w:val="16"/>
+                <w:sz w:val="15"/>
               </w:rPr>
               <w:t>Post-release audit, selected product scope, risk/acceptance inventory, comprehensive DOCX, planning status and handoff</w:t>
             </w:r>
@@ -2467,9 +2707,12 @@
             <w:tcW w:type="dxa" w:w="3213"/>
           </w:tcPr>
           <w:p>
+            <w:pPr>
+              <w:spacing w:after="0"/>
+            </w:pPr>
             <w:r>
               <w:rPr>
-                <w:sz w:val="16"/>
+                <w:sz w:val="15"/>
               </w:rPr>
               <w:t>No application code; document-source gate</w:t>
             </w:r>
@@ -2485,10 +2728,13 @@
             <w:tcW w:type="dxa" w:w="3213"/>
           </w:tcPr>
           <w:p>
+            <w:pPr>
+              <w:spacing w:after="0"/>
+            </w:pPr>
             <w:r>
               <w:rPr>
                 <w:b/>
-                <w:sz w:val="16"/>
+                <w:sz w:val="15"/>
               </w:rPr>
               <w:t>01</w:t>
             </w:r>
@@ -2499,9 +2745,12 @@
             <w:tcW w:type="dxa" w:w="3213"/>
           </w:tcPr>
           <w:p>
+            <w:pPr>
+              <w:spacing w:after="0"/>
+            </w:pPr>
             <w:r>
               <w:rPr>
-                <w:sz w:val="16"/>
+                <w:sz w:val="15"/>
               </w:rPr>
               <w:t>Functional recovery lifecycle rules, decision state machine, Save/Save As behavior and acceptance matrix, detailed DOCX</w:t>
             </w:r>
@@ -2512,9 +2761,12 @@
             <w:tcW w:type="dxa" w:w="3213"/>
           </w:tcPr>
           <w:p>
+            <w:pPr>
+              <w:spacing w:after="0"/>
+            </w:pPr>
             <w:r>
               <w:rPr>
-                <w:sz w:val="16"/>
+                <w:sz w:val="15"/>
               </w:rPr>
               <w:t>Decisions documented, no contradictions</w:t>
             </w:r>
@@ -2530,10 +2782,13 @@
             <w:tcW w:type="dxa" w:w="3213"/>
           </w:tcPr>
           <w:p>
+            <w:pPr>
+              <w:spacing w:after="0"/>
+            </w:pPr>
             <w:r>
               <w:rPr>
                 <w:b/>
-                <w:sz w:val="16"/>
+                <w:sz w:val="15"/>
               </w:rPr>
               <w:t>02</w:t>
             </w:r>
@@ -2544,9 +2799,12 @@
             <w:tcW w:type="dxa" w:w="3213"/>
           </w:tcPr>
           <w:p>
+            <w:pPr>
+              <w:spacing w:after="0"/>
+            </w:pPr>
             <w:r>
               <w:rPr>
-                <w:sz w:val="16"/>
+                <w:sz w:val="15"/>
               </w:rPr>
               <w:t>Architecture/module wiring map, scheduler contract, error model, security/compatibility plan and detailed DOCX</w:t>
             </w:r>
@@ -2557,9 +2815,12 @@
             <w:tcW w:type="dxa" w:w="3213"/>
           </w:tcPr>
           <w:p>
+            <w:pPr>
+              <w:spacing w:after="0"/>
+            </w:pPr>
             <w:r>
               <w:rPr>
-                <w:sz w:val="16"/>
+                <w:sz w:val="15"/>
               </w:rPr>
               <w:t>Architecture/adapter review PASS</w:t>
             </w:r>
@@ -2575,10 +2836,13 @@
             <w:tcW w:type="dxa" w:w="3213"/>
           </w:tcPr>
           <w:p>
+            <w:pPr>
+              <w:spacing w:after="0"/>
+            </w:pPr>
             <w:r>
               <w:rPr>
                 <w:b/>
-                <w:sz w:val="16"/>
+                <w:sz w:val="15"/>
               </w:rPr>
               <w:t>03 — UI PROMPT HARD STOP</w:t>
             </w:r>
@@ -2589,22 +2853,25 @@
             <w:tcW w:type="dxa" w:w="3213"/>
           </w:tcPr>
           <w:p>
+            <w:pPr>
+              <w:spacing w:after="0"/>
+            </w:pPr>
             <w:r>
               <w:rPr>
-                <w:sz w:val="16"/>
+                <w:sz w:val="15"/>
               </w:rPr>
               <w:t xml:space="preserve">Prompts for each new recovery dialog/state; then </w:t>
             </w:r>
             <w:r>
               <w:rPr>
                 <w:b/>
-                <w:sz w:val="16"/>
+                <w:sz w:val="15"/>
               </w:rPr>
               <w:t>STOP</w:t>
             </w:r>
             <w:r>
               <w:rPr>
-                <w:sz w:val="16"/>
+                <w:sz w:val="15"/>
               </w:rPr>
               <w:t xml:space="preserve"> awaiting final user-approved images and one UI reference DOCX</w:t>
             </w:r>
@@ -2615,9 +2882,12 @@
             <w:tcW w:type="dxa" w:w="3213"/>
           </w:tcPr>
           <w:p>
+            <w:pPr>
+              <w:spacing w:after="0"/>
+            </w:pPr>
             <w:r>
               <w:rPr>
-                <w:sz w:val="16"/>
+                <w:sz w:val="15"/>
               </w:rPr>
               <w:t>No coding until final visual gate</w:t>
             </w:r>
@@ -2633,10 +2903,13 @@
             <w:tcW w:type="dxa" w:w="3213"/>
           </w:tcPr>
           <w:p>
+            <w:pPr>
+              <w:spacing w:after="0"/>
+            </w:pPr>
             <w:r>
               <w:rPr>
                 <w:b/>
-                <w:sz w:val="16"/>
+                <w:sz w:val="15"/>
               </w:rPr>
               <w:t>04</w:t>
             </w:r>
@@ -2647,9 +2920,12 @@
             <w:tcW w:type="dxa" w:w="3213"/>
           </w:tcPr>
           <w:p>
+            <w:pPr>
+              <w:spacing w:after="0"/>
+            </w:pPr>
             <w:r>
               <w:rPr>
-                <w:sz w:val="16"/>
+                <w:sz w:val="15"/>
               </w:rPr>
               <w:t>Deterministic test/failure injection, Windows portable and regression plan, detailed DOCX</w:t>
             </w:r>
@@ -2660,9 +2936,12 @@
             <w:tcW w:type="dxa" w:w="3213"/>
           </w:tcPr>
           <w:p>
+            <w:pPr>
+              <w:spacing w:after="0"/>
+            </w:pPr>
             <w:r>
               <w:rPr>
-                <w:sz w:val="16"/>
+                <w:sz w:val="15"/>
               </w:rPr>
               <w:t>Test-first coverage planned</w:t>
             </w:r>
@@ -2678,10 +2957,13 @@
             <w:tcW w:type="dxa" w:w="3213"/>
           </w:tcPr>
           <w:p>
+            <w:pPr>
+              <w:spacing w:after="0"/>
+            </w:pPr>
             <w:r>
               <w:rPr>
                 <w:b/>
-                <w:sz w:val="16"/>
+                <w:sz w:val="15"/>
               </w:rPr>
               <w:t>05</w:t>
             </w:r>
@@ -2692,9 +2974,12 @@
             <w:tcW w:type="dxa" w:w="3213"/>
           </w:tcPr>
           <w:p>
+            <w:pPr>
+              <w:spacing w:after="0"/>
+            </w:pPr>
             <w:r>
               <w:rPr>
-                <w:sz w:val="16"/>
+                <w:sz w:val="15"/>
               </w:rPr>
               <w:t>Final implementation authorization, precise file/wave change map, all planning + UI DOCXs committed to repo</w:t>
             </w:r>
@@ -2705,9 +2990,12 @@
             <w:tcW w:type="dxa" w:w="3213"/>
           </w:tcPr>
           <w:p>
+            <w:pPr>
+              <w:spacing w:after="0"/>
+            </w:pPr>
             <w:r>
               <w:rPr>
-                <w:sz w:val="16"/>
+                <w:sz w:val="15"/>
               </w:rPr>
               <w:t>Only authorized coding gate</w:t>
             </w:r>
@@ -2723,10 +3011,13 @@
             <w:tcW w:type="dxa" w:w="3213"/>
           </w:tcPr>
           <w:p>
+            <w:pPr>
+              <w:spacing w:after="0"/>
+            </w:pPr>
             <w:r>
               <w:rPr>
                 <w:b/>
-                <w:sz w:val="16"/>
+                <w:sz w:val="15"/>
               </w:rPr>
               <w:t>06</w:t>
             </w:r>
@@ -2737,9 +3028,12 @@
             <w:tcW w:type="dxa" w:w="3213"/>
           </w:tcPr>
           <w:p>
+            <w:pPr>
+              <w:spacing w:after="0"/>
+            </w:pPr>
             <w:r>
               <w:rPr>
-                <w:sz w:val="16"/>
+                <w:sz w:val="15"/>
               </w:rPr>
               <w:t>SOL implementation one wave per user turn; tests, commit, Windows acceptance, concise status</w:t>
             </w:r>
@@ -2750,9 +3044,12 @@
             <w:tcW w:type="dxa" w:w="3213"/>
           </w:tcPr>
           <w:p>
+            <w:pPr>
+              <w:spacing w:after="0"/>
+            </w:pPr>
             <w:r>
               <w:rPr>
-                <w:sz w:val="16"/>
+                <w:sz w:val="15"/>
               </w:rPr>
               <w:t>Every authorized wave PASS</w:t>
             </w:r>
@@ -2768,10 +3065,13 @@
             <w:tcW w:type="dxa" w:w="3213"/>
           </w:tcPr>
           <w:p>
+            <w:pPr>
+              <w:spacing w:after="0"/>
+            </w:pPr>
             <w:r>
               <w:rPr>
                 <w:b/>
-                <w:sz w:val="16"/>
+                <w:sz w:val="15"/>
               </w:rPr>
               <w:t>07</w:t>
             </w:r>
@@ -2782,9 +3082,12 @@
             <w:tcW w:type="dxa" w:w="3213"/>
           </w:tcPr>
           <w:p>
+            <w:pPr>
+              <w:spacing w:after="0"/>
+            </w:pPr>
             <w:r>
               <w:rPr>
-                <w:sz w:val="16"/>
+                <w:sz w:val="15"/>
               </w:rPr>
               <w:t>Frozen RC, final Windows/CodeQL/security, exact-source checksums and immutable new release gate</w:t>
             </w:r>
@@ -2795,9 +3098,12 @@
             <w:tcW w:type="dxa" w:w="3213"/>
           </w:tcPr>
           <w:p>
+            <w:pPr>
+              <w:spacing w:after="0"/>
+            </w:pPr>
             <w:r>
               <w:rPr>
-                <w:sz w:val="16"/>
+                <w:sz w:val="15"/>
               </w:rPr>
               <w:t>Published only after complete PASS</w:t>
             </w:r>
@@ -2973,7 +3279,7 @@
       <w:headerReference w:type="default" r:id="rId9"/>
       <w:footerReference w:type="default" r:id="rId10"/>
       <w:pgSz w:w="11906" w:h="16838"/>
-      <w:pgMar w:top="964" w:right="1134" w:bottom="964" w:left="1134" w:header="720" w:footer="720" w:gutter="0"/>
+      <w:pgMar w:top="918" w:right="1134" w:bottom="862" w:left="1134" w:header="720" w:footer="720" w:gutter="0"/>
       <w:cols w:space="720"/>
       <w:docGrid w:linePitch="360"/>
     </w:sectPr>
@@ -3380,7 +3686,7 @@
     <w:qFormat/>
     <w:rsid w:val="00FC693F"/>
     <w:pPr>
-      <w:spacing w:after="80"/>
+      <w:spacing w:after="70"/>
     </w:pPr>
     <w:rPr>
       <w:rFonts w:ascii="Aptos" w:hAnsi="Aptos"/>

</xml_diff>